<commit_message>
ajout du doc GLPI
</commit_message>
<xml_diff>
--- a/documents/Installation OCS-GLPI.docx
+++ b/documents/Installation OCS-GLPI.docx
@@ -64,11 +64,91 @@
           <w:b/>
           <w:bCs/>
         </w:rPr>
-        <w:t>Commande : apt install apache2 mariadb-server php -y</w:t>
+        <w:t xml:space="preserve">Commande : </w:t>
+      </w:r>
+      <w:proofErr w:type="spellStart"/>
+      <w:r>
+        <w:rPr>
+          <w:b/>
+          <w:bCs/>
+        </w:rPr>
+        <w:t>apt</w:t>
+      </w:r>
+      <w:proofErr w:type="spellEnd"/>
+      <w:r>
+        <w:rPr>
+          <w:b/>
+          <w:bCs/>
+        </w:rPr>
+        <w:t xml:space="preserve"> </w:t>
+      </w:r>
+      <w:proofErr w:type="spellStart"/>
+      <w:r>
+        <w:rPr>
+          <w:b/>
+          <w:bCs/>
+        </w:rPr>
+        <w:t>install</w:t>
+      </w:r>
+      <w:proofErr w:type="spellEnd"/>
+      <w:r>
+        <w:rPr>
+          <w:b/>
+          <w:bCs/>
+        </w:rPr>
+        <w:t xml:space="preserve"> apache2 </w:t>
+      </w:r>
+      <w:proofErr w:type="spellStart"/>
+      <w:r>
+        <w:rPr>
+          <w:b/>
+          <w:bCs/>
+        </w:rPr>
+        <w:t>mariadb</w:t>
+      </w:r>
+      <w:proofErr w:type="spellEnd"/>
+      <w:r>
+        <w:rPr>
+          <w:b/>
+          <w:bCs/>
+        </w:rPr>
+        <w:t xml:space="preserve">-server </w:t>
+      </w:r>
+      <w:proofErr w:type="spellStart"/>
+      <w:r>
+        <w:rPr>
+          <w:b/>
+          <w:bCs/>
+        </w:rPr>
+        <w:t>php</w:t>
+      </w:r>
+      <w:proofErr w:type="spellEnd"/>
+      <w:r>
+        <w:rPr>
+          <w:b/>
+          <w:bCs/>
+        </w:rPr>
+        <w:t xml:space="preserve"> -y</w:t>
       </w:r>
       <w:r>
         <w:br/>
-        <w:t>Installe apache2 mariadb-server et php (apache2 était déjà installer)</w:t>
+        <w:t xml:space="preserve">Installe apache2 </w:t>
+      </w:r>
+      <w:proofErr w:type="spellStart"/>
+      <w:r>
+        <w:t>mariadb</w:t>
+      </w:r>
+      <w:proofErr w:type="spellEnd"/>
+      <w:r>
+        <w:t xml:space="preserve">-server et </w:t>
+      </w:r>
+      <w:proofErr w:type="spellStart"/>
+      <w:r>
+        <w:t>php</w:t>
+      </w:r>
+      <w:proofErr w:type="spellEnd"/>
+      <w:r>
+        <w:t xml:space="preserve"> (apache2 était déjà installer)</w:t>
       </w:r>
     </w:p>
     <w:p>
@@ -149,8 +229,65 @@
           <w:b/>
           <w:bCs/>
         </w:rPr>
-        <w:t>Installation de la librairie PERL et les modules php et mysql : apt db</w:t>
-      </w:r>
+        <w:t xml:space="preserve">Installation de la librairie PERL et les modules </w:t>
+      </w:r>
+      <w:proofErr w:type="spellStart"/>
+      <w:r>
+        <w:rPr>
+          <w:b/>
+          <w:bCs/>
+        </w:rPr>
+        <w:t>php</w:t>
+      </w:r>
+      <w:proofErr w:type="spellEnd"/>
+      <w:r>
+        <w:rPr>
+          <w:b/>
+          <w:bCs/>
+        </w:rPr>
+        <w:t xml:space="preserve"> et </w:t>
+      </w:r>
+      <w:proofErr w:type="spellStart"/>
+      <w:r>
+        <w:rPr>
+          <w:b/>
+          <w:bCs/>
+        </w:rPr>
+        <w:t>mysql</w:t>
+      </w:r>
+      <w:proofErr w:type="spellEnd"/>
+      <w:r>
+        <w:rPr>
+          <w:b/>
+          <w:bCs/>
+        </w:rPr>
+        <w:t xml:space="preserve"> : </w:t>
+      </w:r>
+      <w:proofErr w:type="spellStart"/>
+      <w:r>
+        <w:rPr>
+          <w:b/>
+          <w:bCs/>
+        </w:rPr>
+        <w:t>apt</w:t>
+      </w:r>
+      <w:proofErr w:type="spellEnd"/>
+      <w:r>
+        <w:rPr>
+          <w:b/>
+          <w:bCs/>
+        </w:rPr>
+        <w:t xml:space="preserve"> </w:t>
+      </w:r>
+      <w:proofErr w:type="spellStart"/>
+      <w:r>
+        <w:rPr>
+          <w:b/>
+          <w:bCs/>
+        </w:rPr>
+        <w:t>db</w:t>
+      </w:r>
+      <w:proofErr w:type="spellEnd"/>
     </w:p>
     <w:p>
       <w:pPr>
@@ -183,8 +320,21 @@
         </w:rPr>
         <w:br/>
       </w:r>
-      <w:r>
-        <w:t xml:space="preserve">apt install -y libapache2-mod-perl2 </w:t>
+      <w:proofErr w:type="spellStart"/>
+      <w:r>
+        <w:t>apt</w:t>
+      </w:r>
+      <w:proofErr w:type="spellEnd"/>
+      <w:r>
+        <w:t xml:space="preserve"> </w:t>
+      </w:r>
+      <w:proofErr w:type="spellStart"/>
+      <w:r>
+        <w:t>install</w:t>
+      </w:r>
+      <w:proofErr w:type="spellEnd"/>
+      <w:r>
+        <w:t xml:space="preserve"> -y libapache2-mod-perl2 </w:t>
       </w:r>
     </w:p>
     <w:p>
@@ -195,8 +345,29 @@
         </w:tabs>
         <w:ind w:left="360"/>
       </w:pPr>
-      <w:r>
-        <w:t xml:space="preserve">apt install -y libxml-simple-perl </w:t>
+      <w:proofErr w:type="spellStart"/>
+      <w:r>
+        <w:t>apt</w:t>
+      </w:r>
+      <w:proofErr w:type="spellEnd"/>
+      <w:r>
+        <w:t xml:space="preserve"> </w:t>
+      </w:r>
+      <w:proofErr w:type="spellStart"/>
+      <w:r>
+        <w:t>install</w:t>
+      </w:r>
+      <w:proofErr w:type="spellEnd"/>
+      <w:r>
+        <w:t xml:space="preserve"> -y </w:t>
+      </w:r>
+      <w:proofErr w:type="spellStart"/>
+      <w:r>
+        <w:t>libxml</w:t>
+      </w:r>
+      <w:proofErr w:type="spellEnd"/>
+      <w:r>
+        <w:t xml:space="preserve">-simple-perl </w:t>
       </w:r>
     </w:p>
     <w:p>
@@ -207,8 +378,37 @@
         </w:tabs>
         <w:ind w:left="360"/>
       </w:pPr>
-      <w:r>
-        <w:t xml:space="preserve">apt install -y libnet-ip-perl </w:t>
+      <w:proofErr w:type="spellStart"/>
+      <w:r>
+        <w:t>apt</w:t>
+      </w:r>
+      <w:proofErr w:type="spellEnd"/>
+      <w:r>
+        <w:t xml:space="preserve"> </w:t>
+      </w:r>
+      <w:proofErr w:type="spellStart"/>
+      <w:r>
+        <w:t>install</w:t>
+      </w:r>
+      <w:proofErr w:type="spellEnd"/>
+      <w:r>
+        <w:t xml:space="preserve"> -y </w:t>
+      </w:r>
+      <w:proofErr w:type="spellStart"/>
+      <w:r>
+        <w:t>libnet</w:t>
+      </w:r>
+      <w:proofErr w:type="spellEnd"/>
+      <w:r>
+        <w:t>-</w:t>
+      </w:r>
+      <w:proofErr w:type="spellStart"/>
+      <w:r>
+        <w:t>ip</w:t>
+      </w:r>
+      <w:proofErr w:type="spellEnd"/>
+      <w:r>
+        <w:t xml:space="preserve">-perl </w:t>
       </w:r>
     </w:p>
     <w:p>
@@ -219,8 +419,29 @@
         </w:tabs>
         <w:ind w:left="360"/>
       </w:pPr>
-      <w:r>
-        <w:t xml:space="preserve">apt install -y libsoap-lite-perl </w:t>
+      <w:proofErr w:type="spellStart"/>
+      <w:r>
+        <w:t>apt</w:t>
+      </w:r>
+      <w:proofErr w:type="spellEnd"/>
+      <w:r>
+        <w:t xml:space="preserve"> </w:t>
+      </w:r>
+      <w:proofErr w:type="spellStart"/>
+      <w:r>
+        <w:t>install</w:t>
+      </w:r>
+      <w:proofErr w:type="spellEnd"/>
+      <w:r>
+        <w:t xml:space="preserve"> -y </w:t>
+      </w:r>
+      <w:proofErr w:type="spellStart"/>
+      <w:r>
+        <w:t>libsoap</w:t>
+      </w:r>
+      <w:proofErr w:type="spellEnd"/>
+      <w:r>
+        <w:t xml:space="preserve">-lite-perl </w:t>
       </w:r>
     </w:p>
     <w:p>
@@ -230,8 +451,14 @@
           <w:tab w:val="left" w:pos="993"/>
         </w:tabs>
         <w:ind w:left="360"/>
-      </w:pPr>
-      <w:r>
+        <w:rPr>
+          <w:lang w:val="en-US"/>
+        </w:rPr>
+      </w:pPr>
+      <w:r>
+        <w:rPr>
+          <w:lang w:val="en-US"/>
+        </w:rPr>
         <w:t xml:space="preserve">apt install -y libapache2-mod-perl2-dev </w:t>
       </w:r>
     </w:p>
@@ -242,8 +469,14 @@
           <w:tab w:val="left" w:pos="993"/>
         </w:tabs>
         <w:ind w:left="360"/>
-      </w:pPr>
-      <w:r>
+        <w:rPr>
+          <w:lang w:val="en-US"/>
+        </w:rPr>
+      </w:pPr>
+      <w:r>
+        <w:rPr>
+          <w:lang w:val="en-US"/>
+        </w:rPr>
         <w:t xml:space="preserve">apt install -y make </w:t>
       </w:r>
     </w:p>
@@ -255,8 +488,29 @@
         </w:tabs>
         <w:ind w:left="360"/>
       </w:pPr>
-      <w:r>
-        <w:t xml:space="preserve">apt install -y php-mysql </w:t>
+      <w:proofErr w:type="spellStart"/>
+      <w:r>
+        <w:t>apt</w:t>
+      </w:r>
+      <w:proofErr w:type="spellEnd"/>
+      <w:r>
+        <w:t xml:space="preserve"> </w:t>
+      </w:r>
+      <w:proofErr w:type="spellStart"/>
+      <w:r>
+        <w:t>install</w:t>
+      </w:r>
+      <w:proofErr w:type="spellEnd"/>
+      <w:r>
+        <w:t xml:space="preserve"> -y </w:t>
+      </w:r>
+      <w:proofErr w:type="spellStart"/>
+      <w:r>
+        <w:t>php-mysql</w:t>
+      </w:r>
+      <w:proofErr w:type="spellEnd"/>
+      <w:r>
+        <w:t xml:space="preserve"> </w:t>
       </w:r>
     </w:p>
     <w:p>
@@ -267,8 +521,29 @@
         </w:tabs>
         <w:ind w:left="360"/>
       </w:pPr>
-      <w:r>
-        <w:t xml:space="preserve">apt install -y php-gd </w:t>
+      <w:proofErr w:type="spellStart"/>
+      <w:r>
+        <w:t>apt</w:t>
+      </w:r>
+      <w:proofErr w:type="spellEnd"/>
+      <w:r>
+        <w:t xml:space="preserve"> </w:t>
+      </w:r>
+      <w:proofErr w:type="spellStart"/>
+      <w:r>
+        <w:t>install</w:t>
+      </w:r>
+      <w:proofErr w:type="spellEnd"/>
+      <w:r>
+        <w:t xml:space="preserve"> -y </w:t>
+      </w:r>
+      <w:proofErr w:type="spellStart"/>
+      <w:r>
+        <w:t>php</w:t>
+      </w:r>
+      <w:proofErr w:type="spellEnd"/>
+      <w:r>
+        <w:t xml:space="preserve">-gd </w:t>
       </w:r>
     </w:p>
     <w:p>
@@ -279,8 +554,29 @@
         </w:tabs>
         <w:ind w:left="360"/>
       </w:pPr>
-      <w:r>
-        <w:t xml:space="preserve">apt install -y php-mbstring </w:t>
+      <w:proofErr w:type="spellStart"/>
+      <w:r>
+        <w:t>apt</w:t>
+      </w:r>
+      <w:proofErr w:type="spellEnd"/>
+      <w:r>
+        <w:t xml:space="preserve"> </w:t>
+      </w:r>
+      <w:proofErr w:type="spellStart"/>
+      <w:r>
+        <w:t>install</w:t>
+      </w:r>
+      <w:proofErr w:type="spellEnd"/>
+      <w:r>
+        <w:t xml:space="preserve"> -y </w:t>
+      </w:r>
+      <w:proofErr w:type="spellStart"/>
+      <w:r>
+        <w:t>php-mbstring</w:t>
+      </w:r>
+      <w:proofErr w:type="spellEnd"/>
+      <w:r>
+        <w:t xml:space="preserve"> </w:t>
       </w:r>
     </w:p>
     <w:p>
@@ -291,8 +587,29 @@
         </w:tabs>
         <w:ind w:left="360"/>
       </w:pPr>
-      <w:r>
-        <w:t xml:space="preserve">apt install -y php-soap </w:t>
+      <w:proofErr w:type="spellStart"/>
+      <w:r>
+        <w:t>apt</w:t>
+      </w:r>
+      <w:proofErr w:type="spellEnd"/>
+      <w:r>
+        <w:t xml:space="preserve"> </w:t>
+      </w:r>
+      <w:proofErr w:type="spellStart"/>
+      <w:r>
+        <w:t>install</w:t>
+      </w:r>
+      <w:proofErr w:type="spellEnd"/>
+      <w:r>
+        <w:t xml:space="preserve"> -y </w:t>
+      </w:r>
+      <w:proofErr w:type="spellStart"/>
+      <w:r>
+        <w:t>php</w:t>
+      </w:r>
+      <w:proofErr w:type="spellEnd"/>
+      <w:r>
+        <w:t xml:space="preserve">-soap </w:t>
       </w:r>
     </w:p>
     <w:p>
@@ -303,8 +620,29 @@
         </w:tabs>
         <w:ind w:left="360"/>
       </w:pPr>
-      <w:r>
-        <w:t xml:space="preserve">apt install -y php-xml </w:t>
+      <w:proofErr w:type="spellStart"/>
+      <w:r>
+        <w:t>apt</w:t>
+      </w:r>
+      <w:proofErr w:type="spellEnd"/>
+      <w:r>
+        <w:t xml:space="preserve"> </w:t>
+      </w:r>
+      <w:proofErr w:type="spellStart"/>
+      <w:r>
+        <w:t>install</w:t>
+      </w:r>
+      <w:proofErr w:type="spellEnd"/>
+      <w:r>
+        <w:t xml:space="preserve"> -y </w:t>
+      </w:r>
+      <w:proofErr w:type="spellStart"/>
+      <w:r>
+        <w:t>php</w:t>
+      </w:r>
+      <w:proofErr w:type="spellEnd"/>
+      <w:r>
+        <w:t xml:space="preserve">-xml </w:t>
       </w:r>
     </w:p>
     <w:p>
@@ -315,9 +653,27 @@
         </w:tabs>
         <w:ind w:left="360"/>
       </w:pPr>
-      <w:r>
-        <w:t>apt install -y php-curl</w:t>
-      </w:r>
+      <w:proofErr w:type="spellStart"/>
+      <w:r>
+        <w:t>apt</w:t>
+      </w:r>
+      <w:proofErr w:type="spellEnd"/>
+      <w:r>
+        <w:t xml:space="preserve"> </w:t>
+      </w:r>
+      <w:proofErr w:type="spellStart"/>
+      <w:r>
+        <w:t>install</w:t>
+      </w:r>
+      <w:proofErr w:type="spellEnd"/>
+      <w:r>
+        <w:t xml:space="preserve"> -y </w:t>
+      </w:r>
+      <w:proofErr w:type="spellStart"/>
+      <w:r>
+        <w:t>php-curl</w:t>
+      </w:r>
+      <w:proofErr w:type="spellEnd"/>
     </w:p>
     <w:p>
       <w:pPr>
@@ -1050,11 +1406,19 @@
           <w:lang w:val="en-US"/>
         </w:rPr>
       </w:pPr>
-      <w:r>
-        <w:rPr>
-          <w:lang w:val="en-US"/>
-        </w:rPr>
-        <w:t xml:space="preserve">perl -MCPAN -e "install XML::Entities" </w:t>
+      <w:proofErr w:type="spellStart"/>
+      <w:r>
+        <w:rPr>
+          <w:lang w:val="en-US"/>
+        </w:rPr>
+        <w:t>perl</w:t>
+      </w:r>
+      <w:proofErr w:type="spellEnd"/>
+      <w:r>
+        <w:rPr>
+          <w:lang w:val="en-US"/>
+        </w:rPr>
+        <w:t xml:space="preserve"> -MCPAN -e "install XML::Entities" </w:t>
       </w:r>
     </w:p>
     <w:p>
@@ -1068,11 +1432,19 @@
           <w:lang w:val="en-US"/>
         </w:rPr>
       </w:pPr>
-      <w:r>
-        <w:rPr>
-          <w:lang w:val="en-US"/>
-        </w:rPr>
-        <w:t xml:space="preserve">cpan Apache2::SOAP </w:t>
+      <w:proofErr w:type="spellStart"/>
+      <w:r>
+        <w:rPr>
+          <w:lang w:val="en-US"/>
+        </w:rPr>
+        <w:t>cpan</w:t>
+      </w:r>
+      <w:proofErr w:type="spellEnd"/>
+      <w:r>
+        <w:rPr>
+          <w:lang w:val="en-US"/>
+        </w:rPr>
+        <w:t xml:space="preserve"> Apache2::SOAP </w:t>
       </w:r>
     </w:p>
     <w:p>
@@ -1086,11 +1458,75 @@
           <w:lang w:val="en-US"/>
         </w:rPr>
       </w:pPr>
-      <w:r>
-        <w:rPr>
-          <w:lang w:val="en-US"/>
-        </w:rPr>
-        <w:t xml:space="preserve">cpan SOAP::Lite (Pour la question : Please tell me where i can find your apache src, tapez CTRL+C) </w:t>
+      <w:proofErr w:type="spellStart"/>
+      <w:r>
+        <w:rPr>
+          <w:lang w:val="en-US"/>
+        </w:rPr>
+        <w:t>cpan</w:t>
+      </w:r>
+      <w:proofErr w:type="spellEnd"/>
+      <w:r>
+        <w:rPr>
+          <w:lang w:val="en-US"/>
+        </w:rPr>
+        <w:t xml:space="preserve"> SOAP::Lite (Pour la question : Please tell me where </w:t>
+      </w:r>
+      <w:proofErr w:type="spellStart"/>
+      <w:r>
+        <w:rPr>
+          <w:lang w:val="en-US"/>
+        </w:rPr>
+        <w:t>i</w:t>
+      </w:r>
+      <w:proofErr w:type="spellEnd"/>
+      <w:r>
+        <w:rPr>
+          <w:lang w:val="en-US"/>
+        </w:rPr>
+        <w:t xml:space="preserve"> can find your </w:t>
+      </w:r>
+      <w:proofErr w:type="spellStart"/>
+      <w:r>
+        <w:rPr>
+          <w:lang w:val="en-US"/>
+        </w:rPr>
+        <w:t>apache</w:t>
+      </w:r>
+      <w:proofErr w:type="spellEnd"/>
+      <w:r>
+        <w:rPr>
+          <w:lang w:val="en-US"/>
+        </w:rPr>
+        <w:t xml:space="preserve"> </w:t>
+      </w:r>
+      <w:proofErr w:type="spellStart"/>
+      <w:r>
+        <w:rPr>
+          <w:lang w:val="en-US"/>
+        </w:rPr>
+        <w:t>src</w:t>
+      </w:r>
+      <w:proofErr w:type="spellEnd"/>
+      <w:r>
+        <w:rPr>
+          <w:lang w:val="en-US"/>
+        </w:rPr>
+        <w:t xml:space="preserve">, </w:t>
+      </w:r>
+      <w:proofErr w:type="spellStart"/>
+      <w:r>
+        <w:rPr>
+          <w:lang w:val="en-US"/>
+        </w:rPr>
+        <w:t>tapez</w:t>
+      </w:r>
+      <w:proofErr w:type="spellEnd"/>
+      <w:r>
+        <w:rPr>
+          <w:lang w:val="en-US"/>
+        </w:rPr>
+        <w:t xml:space="preserve"> CTRL+C) </w:t>
       </w:r>
     </w:p>
     <w:p>
@@ -1101,8 +1537,21 @@
         </w:tabs>
         <w:ind w:left="360"/>
       </w:pPr>
-      <w:r>
-        <w:t xml:space="preserve">cpan Mojolicious::Lite </w:t>
+      <w:proofErr w:type="spellStart"/>
+      <w:r>
+        <w:t>cpan</w:t>
+      </w:r>
+      <w:proofErr w:type="spellEnd"/>
+      <w:r>
+        <w:t xml:space="preserve"> </w:t>
+      </w:r>
+      <w:proofErr w:type="spellStart"/>
+      <w:r>
+        <w:t>Mojolicious</w:t>
+      </w:r>
+      <w:proofErr w:type="spellEnd"/>
+      <w:r>
+        <w:t xml:space="preserve">::Lite </w:t>
       </w:r>
     </w:p>
     <w:p>
@@ -1113,8 +1562,13 @@
         </w:tabs>
         <w:ind w:left="360"/>
       </w:pPr>
-      <w:r>
-        <w:t>cpan Switch</w:t>
+      <w:proofErr w:type="spellStart"/>
+      <w:r>
+        <w:t>cpan</w:t>
+      </w:r>
+      <w:proofErr w:type="spellEnd"/>
+      <w:r>
+        <w:t xml:space="preserve"> Switch</w:t>
       </w:r>
     </w:p>
     <w:p>
@@ -1426,13 +1880,47 @@
       <w:r>
         <w:t xml:space="preserve"> : </w:t>
       </w:r>
-      <w:r>
-        <w:rPr>
-          <w:b/>
-          <w:bCs/>
-        </w:rPr>
-        <w:t>apt install wget</w:t>
-      </w:r>
+      <w:proofErr w:type="spellStart"/>
+      <w:r>
+        <w:rPr>
+          <w:b/>
+          <w:bCs/>
+        </w:rPr>
+        <w:t>apt</w:t>
+      </w:r>
+      <w:proofErr w:type="spellEnd"/>
+      <w:r>
+        <w:rPr>
+          <w:b/>
+          <w:bCs/>
+        </w:rPr>
+        <w:t xml:space="preserve"> </w:t>
+      </w:r>
+      <w:proofErr w:type="spellStart"/>
+      <w:r>
+        <w:rPr>
+          <w:b/>
+          <w:bCs/>
+        </w:rPr>
+        <w:t>install</w:t>
+      </w:r>
+      <w:proofErr w:type="spellEnd"/>
+      <w:r>
+        <w:rPr>
+          <w:b/>
+          <w:bCs/>
+        </w:rPr>
+        <w:t xml:space="preserve"> </w:t>
+      </w:r>
+      <w:proofErr w:type="spellStart"/>
+      <w:r>
+        <w:rPr>
+          <w:b/>
+          <w:bCs/>
+        </w:rPr>
+        <w:t>wget</w:t>
+      </w:r>
+      <w:proofErr w:type="spellEnd"/>
     </w:p>
     <w:p>
       <w:pPr>
@@ -1502,21 +1990,67 @@
           <w:lang w:val="en-US"/>
         </w:rPr>
       </w:pPr>
-      <w:r>
-        <w:rPr>
-          <w:b/>
-          <w:bCs/>
-          <w:lang w:val="en-US"/>
-        </w:rPr>
-        <w:t>Commande : wget « </w:t>
-      </w:r>
-      <w:r>
-        <w:rPr>
-          <w:b/>
-          <w:bCs/>
-          <w:lang w:val="en-US"/>
-        </w:rPr>
-        <w:t>https://github.com/OCSInventory-NG/OCSInventory- ocsreports/releases/download/2.10.0/ OCSNG_UNIX_SERVER-2.10.0.tar.gz</w:t>
+      <w:proofErr w:type="spellStart"/>
+      <w:r>
+        <w:rPr>
+          <w:b/>
+          <w:bCs/>
+          <w:lang w:val="en-US"/>
+        </w:rPr>
+        <w:t>Commande</w:t>
+      </w:r>
+      <w:proofErr w:type="spellEnd"/>
+      <w:r>
+        <w:rPr>
+          <w:b/>
+          <w:bCs/>
+          <w:lang w:val="en-US"/>
+        </w:rPr>
+        <w:t xml:space="preserve"> : </w:t>
+      </w:r>
+      <w:proofErr w:type="spellStart"/>
+      <w:r>
+        <w:rPr>
+          <w:b/>
+          <w:bCs/>
+          <w:lang w:val="en-US"/>
+        </w:rPr>
+        <w:t>wget</w:t>
+      </w:r>
+      <w:proofErr w:type="spellEnd"/>
+      <w:r>
+        <w:rPr>
+          <w:b/>
+          <w:bCs/>
+          <w:lang w:val="en-US"/>
+        </w:rPr>
+        <w:t xml:space="preserve"> « </w:t>
+      </w:r>
+      <w:r>
+        <w:rPr>
+          <w:b/>
+          <w:bCs/>
+          <w:lang w:val="en-US"/>
+        </w:rPr>
+        <w:t xml:space="preserve">https://github.com/OCSInventory-NG/OCSInventory- </w:t>
+      </w:r>
+      <w:proofErr w:type="spellStart"/>
+      <w:r>
+        <w:rPr>
+          <w:b/>
+          <w:bCs/>
+          <w:lang w:val="en-US"/>
+        </w:rPr>
+        <w:t>ocsreports</w:t>
+      </w:r>
+      <w:proofErr w:type="spellEnd"/>
+      <w:r>
+        <w:rPr>
+          <w:b/>
+          <w:bCs/>
+          <w:lang w:val="en-US"/>
+        </w:rPr>
+        <w:t>/releases/download/2.10.0/ OCSNG_UNIX_SERVER-2.10.0.tar.gz</w:t>
       </w:r>
       <w:r>
         <w:rPr>
@@ -1636,7 +2170,23 @@
           <w:b/>
           <w:bCs/>
         </w:rPr>
-        <w:t xml:space="preserve">Commande : tar xvzf </w:t>
+        <w:t xml:space="preserve">Commande : tar </w:t>
+      </w:r>
+      <w:proofErr w:type="spellStart"/>
+      <w:r>
+        <w:rPr>
+          <w:b/>
+          <w:bCs/>
+        </w:rPr>
+        <w:t>xvzf</w:t>
+      </w:r>
+      <w:proofErr w:type="spellEnd"/>
+      <w:r>
+        <w:rPr>
+          <w:b/>
+          <w:bCs/>
+        </w:rPr>
+        <w:t xml:space="preserve"> </w:t>
       </w:r>
       <w:r>
         <w:rPr>
@@ -1893,6 +2443,7 @@
           <w:lang w:val="en-US"/>
         </w:rPr>
       </w:pPr>
+      <w:proofErr w:type="spellStart"/>
       <w:r>
         <w:rPr>
           <w:b/>
@@ -1900,7 +2451,16 @@
           <w:lang w:val="en-US"/>
         </w:rPr>
         <w:lastRenderedPageBreak/>
-        <w:t>Répondre au question</w:t>
+        <w:t>Répondre</w:t>
+      </w:r>
+      <w:proofErr w:type="spellEnd"/>
+      <w:r>
+        <w:rPr>
+          <w:b/>
+          <w:bCs/>
+          <w:lang w:val="en-US"/>
+        </w:rPr>
+        <w:t xml:space="preserve"> au question</w:t>
       </w:r>
     </w:p>
     <w:p>
@@ -1942,7 +2502,35 @@
         <w:rPr>
           <w:lang w:val="en-US"/>
         </w:rPr>
-        <w:t xml:space="preserve">On which port is running database server [3306] ? Entrée Where is Apache daemon binary [/usr/sbin/apache2ctl] Entrée </w:t>
+        <w:t>On which port is running database server [3306] ? Entrée Where is Apache daemon binary [/</w:t>
+      </w:r>
+      <w:proofErr w:type="spellStart"/>
+      <w:r>
+        <w:rPr>
+          <w:lang w:val="en-US"/>
+        </w:rPr>
+        <w:t>usr</w:t>
+      </w:r>
+      <w:proofErr w:type="spellEnd"/>
+      <w:r>
+        <w:rPr>
+          <w:lang w:val="en-US"/>
+        </w:rPr>
+        <w:t>/</w:t>
+      </w:r>
+      <w:proofErr w:type="spellStart"/>
+      <w:r>
+        <w:rPr>
+          <w:lang w:val="en-US"/>
+        </w:rPr>
+        <w:t>sbin</w:t>
+      </w:r>
+      <w:proofErr w:type="spellEnd"/>
+      <w:r>
+        <w:rPr>
+          <w:lang w:val="en-US"/>
+        </w:rPr>
+        <w:t xml:space="preserve">/apache2ctl] Entrée </w:t>
       </w:r>
     </w:p>
     <w:p>
@@ -1956,7 +2544,21 @@
         <w:rPr>
           <w:lang w:val="en-US"/>
         </w:rPr>
-        <w:t xml:space="preserve">Where is Apache main configuration file [/etc/apache2/apache2.conf] ? Entrée </w:t>
+        <w:t>Where is Apache main configuration file [/</w:t>
+      </w:r>
+      <w:proofErr w:type="spellStart"/>
+      <w:r>
+        <w:rPr>
+          <w:lang w:val="en-US"/>
+        </w:rPr>
+        <w:t>etc</w:t>
+      </w:r>
+      <w:proofErr w:type="spellEnd"/>
+      <w:r>
+        <w:rPr>
+          <w:lang w:val="en-US"/>
+        </w:rPr>
+        <w:t xml:space="preserve">/apache2/apache2.conf] ? Entrée </w:t>
       </w:r>
     </w:p>
     <w:p>
@@ -1998,7 +2600,49 @@
         <w:rPr>
           <w:lang w:val="en-US"/>
         </w:rPr>
-        <w:t xml:space="preserve">Where is Apache Include configuration directory [/etc/apache2/conf-available] ? /etc/apache2/conf-enabled puis Entrée </w:t>
+        <w:t>Where is Apache Include configuration directory [/</w:t>
+      </w:r>
+      <w:proofErr w:type="spellStart"/>
+      <w:r>
+        <w:rPr>
+          <w:lang w:val="en-US"/>
+        </w:rPr>
+        <w:t>etc</w:t>
+      </w:r>
+      <w:proofErr w:type="spellEnd"/>
+      <w:r>
+        <w:rPr>
+          <w:lang w:val="en-US"/>
+        </w:rPr>
+        <w:t>/apache2/conf-available] ? /</w:t>
+      </w:r>
+      <w:proofErr w:type="spellStart"/>
+      <w:r>
+        <w:rPr>
+          <w:lang w:val="en-US"/>
+        </w:rPr>
+        <w:t>etc</w:t>
+      </w:r>
+      <w:proofErr w:type="spellEnd"/>
+      <w:r>
+        <w:rPr>
+          <w:lang w:val="en-US"/>
+        </w:rPr>
+        <w:t xml:space="preserve">/apache2/conf-enabled </w:t>
+      </w:r>
+      <w:proofErr w:type="spellStart"/>
+      <w:r>
+        <w:rPr>
+          <w:lang w:val="en-US"/>
+        </w:rPr>
+        <w:t>puis</w:t>
+      </w:r>
+      <w:proofErr w:type="spellEnd"/>
+      <w:r>
+        <w:rPr>
+          <w:lang w:val="en-US"/>
+        </w:rPr>
+        <w:t xml:space="preserve"> Entrée </w:t>
       </w:r>
     </w:p>
     <w:p>
@@ -2012,7 +2656,49 @@
         <w:rPr>
           <w:lang w:val="en-US"/>
         </w:rPr>
-        <w:t xml:space="preserve">Where is PERL Intrepreter binary [/usr/bin/perl] ? Entrée </w:t>
+        <w:t xml:space="preserve">Where is PERL </w:t>
+      </w:r>
+      <w:proofErr w:type="spellStart"/>
+      <w:r>
+        <w:rPr>
+          <w:lang w:val="en-US"/>
+        </w:rPr>
+        <w:t>Intrepreter</w:t>
+      </w:r>
+      <w:proofErr w:type="spellEnd"/>
+      <w:r>
+        <w:rPr>
+          <w:lang w:val="en-US"/>
+        </w:rPr>
+        <w:t xml:space="preserve"> binary [/</w:t>
+      </w:r>
+      <w:proofErr w:type="spellStart"/>
+      <w:r>
+        <w:rPr>
+          <w:lang w:val="en-US"/>
+        </w:rPr>
+        <w:t>usr</w:t>
+      </w:r>
+      <w:proofErr w:type="spellEnd"/>
+      <w:r>
+        <w:rPr>
+          <w:lang w:val="en-US"/>
+        </w:rPr>
+        <w:t>/bin/</w:t>
+      </w:r>
+      <w:proofErr w:type="spellStart"/>
+      <w:r>
+        <w:rPr>
+          <w:lang w:val="en-US"/>
+        </w:rPr>
+        <w:t>perl</w:t>
+      </w:r>
+      <w:proofErr w:type="spellEnd"/>
+      <w:r>
+        <w:rPr>
+          <w:lang w:val="en-US"/>
+        </w:rPr>
+        <w:t xml:space="preserve">] ? Entrée </w:t>
       </w:r>
     </w:p>
     <w:p>
@@ -2032,35 +2718,58 @@
     <w:p>
       <w:pPr>
         <w:ind w:firstLine="708"/>
-        <w:rPr>
-          <w:lang w:val="en-US"/>
-        </w:rPr>
-      </w:pPr>
-      <w:r>
-        <w:rPr>
-          <w:lang w:val="en-US"/>
-        </w:rPr>
-        <w:t xml:space="preserve">Where to put Communication server log directory [/var/log/ocsinventory-server] ? </w:t>
-      </w:r>
-      <w:r>
-        <w:rPr>
-          <w:lang w:val="en-US"/>
-        </w:rPr>
+      </w:pPr>
+      <w:r>
+        <w:rPr>
+          <w:lang w:val="en-US"/>
+        </w:rPr>
+        <w:t>Where to put Communication server log directory [/var/log/</w:t>
+      </w:r>
+      <w:proofErr w:type="spellStart"/>
+      <w:r>
+        <w:rPr>
+          <w:lang w:val="en-US"/>
+        </w:rPr>
+        <w:t>ocsinventory</w:t>
+      </w:r>
+      <w:proofErr w:type="spellEnd"/>
+      <w:r>
+        <w:rPr>
+          <w:lang w:val="en-US"/>
+        </w:rPr>
+        <w:t xml:space="preserve">-server] ? </w:t>
+      </w:r>
+      <w:r>
         <w:t xml:space="preserve">Entrée.. </w:t>
       </w:r>
     </w:p>
     <w:p>
       <w:pPr>
         <w:ind w:firstLine="708"/>
-        <w:rPr>
-          <w:lang w:val="en-US"/>
-        </w:rPr>
-      </w:pPr>
-      <w:r>
-        <w:rPr>
-          <w:lang w:val="en-US"/>
-        </w:rPr>
-        <w:t xml:space="preserve">Where to put Communication server plugins configuration files [/etc/ocsinventory-server/plugins] ? Entrée </w:t>
+      </w:pPr>
+      <w:proofErr w:type="spellStart"/>
+      <w:r>
+        <w:t>Where</w:t>
+      </w:r>
+      <w:proofErr w:type="spellEnd"/>
+      <w:r>
+        <w:t xml:space="preserve"> to put Communication server plugins configuration files [/</w:t>
+      </w:r>
+      <w:proofErr w:type="spellStart"/>
+      <w:r>
+        <w:t>etc</w:t>
+      </w:r>
+      <w:proofErr w:type="spellEnd"/>
+      <w:r>
+        <w:t>/</w:t>
+      </w:r>
+      <w:proofErr w:type="spellStart"/>
+      <w:r>
+        <w:t>ocsinventory</w:t>
+      </w:r>
+      <w:proofErr w:type="spellEnd"/>
+      <w:r>
+        <w:t xml:space="preserve">-server/plugins] ? Entrée </w:t>
       </w:r>
     </w:p>
     <w:p>
@@ -2074,7 +2783,49 @@
         <w:rPr>
           <w:lang w:val="en-US"/>
         </w:rPr>
-        <w:t xml:space="preserve">Where to put Communication server plugins Perl modules files [/etc/ocsinventory-server/perl] ? Entrée </w:t>
+        <w:t>Where to put Communication server plugins Perl modules files [/</w:t>
+      </w:r>
+      <w:proofErr w:type="spellStart"/>
+      <w:r>
+        <w:rPr>
+          <w:lang w:val="en-US"/>
+        </w:rPr>
+        <w:t>etc</w:t>
+      </w:r>
+      <w:proofErr w:type="spellEnd"/>
+      <w:r>
+        <w:rPr>
+          <w:lang w:val="en-US"/>
+        </w:rPr>
+        <w:t>/</w:t>
+      </w:r>
+      <w:proofErr w:type="spellStart"/>
+      <w:r>
+        <w:rPr>
+          <w:lang w:val="en-US"/>
+        </w:rPr>
+        <w:t>ocsinventory</w:t>
+      </w:r>
+      <w:proofErr w:type="spellEnd"/>
+      <w:r>
+        <w:rPr>
+          <w:lang w:val="en-US"/>
+        </w:rPr>
+        <w:t>-server/</w:t>
+      </w:r>
+      <w:proofErr w:type="spellStart"/>
+      <w:r>
+        <w:rPr>
+          <w:lang w:val="en-US"/>
+        </w:rPr>
+        <w:t>perl</w:t>
+      </w:r>
+      <w:proofErr w:type="spellEnd"/>
+      <w:r>
+        <w:rPr>
+          <w:lang w:val="en-US"/>
+        </w:rPr>
+        <w:t xml:space="preserve">] ? Entrée </w:t>
       </w:r>
     </w:p>
     <w:p>
@@ -2116,7 +2867,35 @@
         <w:rPr>
           <w:lang w:val="en-US"/>
         </w:rPr>
-        <w:t xml:space="preserve">Where do you want the API code to be store [/usr/local/share/perl/5.24.1]? Entrée </w:t>
+        <w:t>Where do you want the API code to be store [/</w:t>
+      </w:r>
+      <w:proofErr w:type="spellStart"/>
+      <w:r>
+        <w:rPr>
+          <w:lang w:val="en-US"/>
+        </w:rPr>
+        <w:t>usr</w:t>
+      </w:r>
+      <w:proofErr w:type="spellEnd"/>
+      <w:r>
+        <w:rPr>
+          <w:lang w:val="en-US"/>
+        </w:rPr>
+        <w:t>/local/share/</w:t>
+      </w:r>
+      <w:proofErr w:type="spellStart"/>
+      <w:r>
+        <w:rPr>
+          <w:lang w:val="en-US"/>
+        </w:rPr>
+        <w:t>perl</w:t>
+      </w:r>
+      <w:proofErr w:type="spellEnd"/>
+      <w:r>
+        <w:rPr>
+          <w:lang w:val="en-US"/>
+        </w:rPr>
+        <w:t xml:space="preserve">/5.24.1]? Entrée </w:t>
       </w:r>
     </w:p>
     <w:p>
@@ -2127,7 +2906,35 @@
         <w:rPr>
           <w:lang w:val="en-US"/>
         </w:rPr>
-        <w:t xml:space="preserve">Do you allow Setup renaming Communication Server Apache configuration file to 'z-ocsinventory-server.conf' ([y]/n) ? </w:t>
+        <w:t>Do you allow Setup renaming Communication Server Apache configuration file to 'z-</w:t>
+      </w:r>
+      <w:proofErr w:type="spellStart"/>
+      <w:r>
+        <w:rPr>
+          <w:lang w:val="en-US"/>
+        </w:rPr>
+        <w:t>ocsinventory</w:t>
+      </w:r>
+      <w:proofErr w:type="spellEnd"/>
+      <w:r>
+        <w:rPr>
+          <w:lang w:val="en-US"/>
+        </w:rPr>
+        <w:t>-</w:t>
+      </w:r>
+      <w:proofErr w:type="spellStart"/>
+      <w:r>
+        <w:rPr>
+          <w:lang w:val="en-US"/>
+        </w:rPr>
+        <w:t>server.conf</w:t>
+      </w:r>
+      <w:proofErr w:type="spellEnd"/>
+      <w:r>
+        <w:rPr>
+          <w:lang w:val="en-US"/>
+        </w:rPr>
+        <w:t xml:space="preserve">' ([y]/n) ? </w:t>
       </w:r>
       <w:r>
         <w:t>Entrée</w:t>
@@ -2187,7 +2994,15 @@
         </w:numPr>
       </w:pPr>
       <w:r>
-        <w:t>Créer un utilisateur sur mariadb :</w:t>
+        <w:t xml:space="preserve">Créer un utilisateur sur </w:t>
+      </w:r>
+      <w:proofErr w:type="spellStart"/>
+      <w:r>
+        <w:t>mariadb</w:t>
+      </w:r>
+      <w:proofErr w:type="spellEnd"/>
+      <w:r>
+        <w:t> :</w:t>
       </w:r>
     </w:p>
     <w:p>
@@ -2250,7 +3065,23 @@
           <w:b/>
           <w:bCs/>
         </w:rPr>
-        <w:t>Restart mariadb et Apache2</w:t>
+        <w:t xml:space="preserve">Restart </w:t>
+      </w:r>
+      <w:proofErr w:type="spellStart"/>
+      <w:r>
+        <w:rPr>
+          <w:b/>
+          <w:bCs/>
+        </w:rPr>
+        <w:t>mariadb</w:t>
+      </w:r>
+      <w:proofErr w:type="spellEnd"/>
+      <w:r>
+        <w:rPr>
+          <w:b/>
+          <w:bCs/>
+        </w:rPr>
+        <w:t xml:space="preserve"> et Apache2</w:t>
       </w:r>
     </w:p>
     <w:p>
@@ -2265,12 +3096,37 @@
       <w:r>
         <w:t xml:space="preserve">Commande : </w:t>
       </w:r>
-      <w:r>
-        <w:rPr>
-          <w:b/>
-          <w:bCs/>
-        </w:rPr>
-        <w:t>sudo service mariadb restart</w:t>
+      <w:proofErr w:type="spellStart"/>
+      <w:r>
+        <w:rPr>
+          <w:b/>
+          <w:bCs/>
+        </w:rPr>
+        <w:t>sudo</w:t>
+      </w:r>
+      <w:proofErr w:type="spellEnd"/>
+      <w:r>
+        <w:rPr>
+          <w:b/>
+          <w:bCs/>
+        </w:rPr>
+        <w:t xml:space="preserve"> service </w:t>
+      </w:r>
+      <w:proofErr w:type="spellStart"/>
+      <w:r>
+        <w:rPr>
+          <w:b/>
+          <w:bCs/>
+        </w:rPr>
+        <w:t>mariadb</w:t>
+      </w:r>
+      <w:proofErr w:type="spellEnd"/>
+      <w:r>
+        <w:rPr>
+          <w:b/>
+          <w:bCs/>
+        </w:rPr>
+        <w:t xml:space="preserve"> restart</w:t>
       </w:r>
       <w:r>
         <w:t xml:space="preserve"> ET</w:t>
@@ -2278,12 +3134,37 @@
       <w:r>
         <w:t xml:space="preserve"> </w:t>
       </w:r>
-      <w:r>
-        <w:rPr>
-          <w:b/>
-          <w:bCs/>
-        </w:rPr>
-        <w:t>sudo service mariadb restart</w:t>
+      <w:proofErr w:type="spellStart"/>
+      <w:r>
+        <w:rPr>
+          <w:b/>
+          <w:bCs/>
+        </w:rPr>
+        <w:t>sudo</w:t>
+      </w:r>
+      <w:proofErr w:type="spellEnd"/>
+      <w:r>
+        <w:rPr>
+          <w:b/>
+          <w:bCs/>
+        </w:rPr>
+        <w:t xml:space="preserve"> service </w:t>
+      </w:r>
+      <w:proofErr w:type="spellStart"/>
+      <w:r>
+        <w:rPr>
+          <w:b/>
+          <w:bCs/>
+        </w:rPr>
+        <w:t>mariadb</w:t>
+      </w:r>
+      <w:proofErr w:type="spellEnd"/>
+      <w:r>
+        <w:rPr>
+          <w:b/>
+          <w:bCs/>
+        </w:rPr>
+        <w:t xml:space="preserve"> restart</w:t>
       </w:r>
     </w:p>
     <w:p>
@@ -2473,7 +3354,23 @@
           <w:b/>
           <w:bCs/>
         </w:rPr>
-        <w:t>installez l'agent ocsinventory-agent :</w:t>
+        <w:t xml:space="preserve">installez l'agent </w:t>
+      </w:r>
+      <w:proofErr w:type="spellStart"/>
+      <w:r>
+        <w:rPr>
+          <w:b/>
+          <w:bCs/>
+        </w:rPr>
+        <w:t>ocsinventory</w:t>
+      </w:r>
+      <w:proofErr w:type="spellEnd"/>
+      <w:r>
+        <w:rPr>
+          <w:b/>
+          <w:bCs/>
+        </w:rPr>
+        <w:t>-agent :</w:t>
       </w:r>
     </w:p>
     <w:p>
@@ -2484,12 +3381,53 @@
       <w:r>
         <w:t xml:space="preserve">Commande : </w:t>
       </w:r>
-      <w:r>
-        <w:rPr>
-          <w:b/>
-          <w:bCs/>
-        </w:rPr>
-        <w:t>apt install ocsinventory-agent</w:t>
+      <w:proofErr w:type="spellStart"/>
+      <w:r>
+        <w:rPr>
+          <w:b/>
+          <w:bCs/>
+        </w:rPr>
+        <w:t>apt</w:t>
+      </w:r>
+      <w:proofErr w:type="spellEnd"/>
+      <w:r>
+        <w:rPr>
+          <w:b/>
+          <w:bCs/>
+        </w:rPr>
+        <w:t xml:space="preserve"> </w:t>
+      </w:r>
+      <w:proofErr w:type="spellStart"/>
+      <w:r>
+        <w:rPr>
+          <w:b/>
+          <w:bCs/>
+        </w:rPr>
+        <w:t>install</w:t>
+      </w:r>
+      <w:proofErr w:type="spellEnd"/>
+      <w:r>
+        <w:rPr>
+          <w:b/>
+          <w:bCs/>
+        </w:rPr>
+        <w:t xml:space="preserve"> </w:t>
+      </w:r>
+      <w:proofErr w:type="spellStart"/>
+      <w:r>
+        <w:rPr>
+          <w:b/>
+          <w:bCs/>
+        </w:rPr>
+        <w:t>ocsinventory</w:t>
+      </w:r>
+      <w:proofErr w:type="spellEnd"/>
+      <w:r>
+        <w:rPr>
+          <w:b/>
+          <w:bCs/>
+        </w:rPr>
+        <w:t>-agent</w:t>
       </w:r>
       <w:r>
         <w:t xml:space="preserve"> </w:t>
@@ -2572,8 +3510,19 @@
           <w:sz w:val="28"/>
           <w:szCs w:val="28"/>
         </w:rPr>
-        <w:t>Installation de la VM windows</w:t>
-      </w:r>
+        <w:t xml:space="preserve">Installation de la VM </w:t>
+      </w:r>
+      <w:proofErr w:type="spellStart"/>
+      <w:r>
+        <w:rPr>
+          <w:b/>
+          <w:bCs/>
+          <w:sz w:val="28"/>
+          <w:szCs w:val="28"/>
+        </w:rPr>
+        <w:t>windows</w:t>
+      </w:r>
+      <w:proofErr w:type="spellEnd"/>
       <w:r>
         <w:rPr>
           <w:b/>
@@ -2781,7 +3730,15 @@
         </w:drawing>
       </w:r>
       <w:r>
-        <w:t>Ajouter deux « Network Adatater :</w:t>
+        <w:t xml:space="preserve">Ajouter deux « Network </w:t>
+      </w:r>
+      <w:proofErr w:type="spellStart"/>
+      <w:r>
+        <w:t>Adatater</w:t>
+      </w:r>
+      <w:proofErr w:type="spellEnd"/>
+      <w:r>
+        <w:t> :</w:t>
       </w:r>
     </w:p>
     <w:p>
@@ -2807,7 +3764,23 @@
           <w:i/>
           <w:iCs/>
         </w:rPr>
-        <w:t>(lui indiquer le segment lan)</w:t>
+        <w:t xml:space="preserve">(lui indiquer le segment </w:t>
+      </w:r>
+      <w:proofErr w:type="spellStart"/>
+      <w:r>
+        <w:rPr>
+          <w:i/>
+          <w:iCs/>
+        </w:rPr>
+        <w:t>lan</w:t>
+      </w:r>
+      <w:proofErr w:type="spellEnd"/>
+      <w:r>
+        <w:rPr>
+          <w:i/>
+          <w:iCs/>
+        </w:rPr>
+        <w:t>)</w:t>
       </w:r>
     </w:p>
     <w:p>
@@ -2822,8 +3795,13 @@
         </w:tabs>
       </w:pPr>
       <w:r>
-        <w:t>Un en Host-only</w:t>
-      </w:r>
+        <w:t>Un en Host-</w:t>
+      </w:r>
+      <w:proofErr w:type="spellStart"/>
+      <w:r>
+        <w:t>only</w:t>
+      </w:r>
+      <w:proofErr w:type="spellEnd"/>
       <w:r>
         <w:br w:type="textWrapping" w:clear="all"/>
       </w:r>
@@ -2835,7 +3813,39 @@
         </w:tabs>
       </w:pPr>
       <w:r>
-        <w:t>Dans la VM faite la commande « ip -a » pour afficher les reseaux et repérer celui qui na pas d’addresse IP attribuer (</w:t>
+        <w:t>Dans la VM faite la commande « </w:t>
+      </w:r>
+      <w:proofErr w:type="spellStart"/>
+      <w:r>
+        <w:t>ip</w:t>
+      </w:r>
+      <w:proofErr w:type="spellEnd"/>
+      <w:r>
+        <w:t xml:space="preserve"> -a » pour afficher les </w:t>
+      </w:r>
+      <w:proofErr w:type="spellStart"/>
+      <w:r>
+        <w:t>reseaux</w:t>
+      </w:r>
+      <w:proofErr w:type="spellEnd"/>
+      <w:r>
+        <w:t xml:space="preserve"> et repérer celui qui </w:t>
+      </w:r>
+      <w:proofErr w:type="spellStart"/>
+      <w:r>
+        <w:t>na</w:t>
+      </w:r>
+      <w:proofErr w:type="spellEnd"/>
+      <w:r>
+        <w:t xml:space="preserve"> pas d’</w:t>
+      </w:r>
+      <w:proofErr w:type="spellStart"/>
+      <w:r>
+        <w:t>addresse</w:t>
+      </w:r>
+      <w:proofErr w:type="spellEnd"/>
+      <w:r>
+        <w:t xml:space="preserve"> IP attribuer (</w:t>
       </w:r>
       <w:r>
         <w:rPr>
@@ -2853,7 +3863,15 @@
         <w:t xml:space="preserve">Ensuite, </w:t>
       </w:r>
       <w:r>
-        <w:t>accéder au fichier /etc/network/</w:t>
+        <w:t>accéder au fichier /</w:t>
+      </w:r>
+      <w:proofErr w:type="spellStart"/>
+      <w:r>
+        <w:t>etc</w:t>
+      </w:r>
+      <w:proofErr w:type="spellEnd"/>
+      <w:r>
+        <w:t>/network/</w:t>
       </w:r>
       <w:r>
         <w:rPr>
@@ -2969,35 +3987,110 @@
       </w:r>
       <w:r>
         <w:br/>
-        <w:t>- allow-hotplug ens37 #</w:t>
-      </w:r>
-      <w:r>
-        <w:rPr>
-          <w:i/>
-          <w:iCs/>
-        </w:rPr>
-        <w:t>Permet une connexion direct de cette interfaces réseaux une fois detecter</w:t>
-      </w:r>
+        <w:t xml:space="preserve">- </w:t>
+      </w:r>
+      <w:proofErr w:type="spellStart"/>
+      <w:r>
+        <w:t>allow-hotplug</w:t>
+      </w:r>
+      <w:proofErr w:type="spellEnd"/>
+      <w:r>
+        <w:t xml:space="preserve"> ens37 #</w:t>
+      </w:r>
+      <w:r>
+        <w:rPr>
+          <w:i/>
+          <w:iCs/>
+        </w:rPr>
+        <w:t xml:space="preserve">Permet une connexion direct de cette interfaces réseaux une fois </w:t>
+      </w:r>
+      <w:proofErr w:type="spellStart"/>
+      <w:r>
+        <w:rPr>
+          <w:i/>
+          <w:iCs/>
+        </w:rPr>
+        <w:t>detecter</w:t>
+      </w:r>
+      <w:proofErr w:type="spellEnd"/>
       <w:r>
         <w:br/>
-        <w:t xml:space="preserve">- iface ens37 inet static </w:t>
-      </w:r>
-      <w:r>
-        <w:rPr>
-          <w:i/>
-          <w:iCs/>
-        </w:rPr>
-        <w:t xml:space="preserve">#Permet de configurer l’interfaces ciblé comme static ou dhcp (ici </w:t>
-      </w:r>
-      <w:r>
-        <w:rPr>
-          <w:b/>
-          <w:bCs/>
-          <w:i/>
-          <w:iCs/>
-        </w:rPr>
+        <w:t xml:space="preserve">- </w:t>
+      </w:r>
+      <w:proofErr w:type="spellStart"/>
+      <w:r>
+        <w:t>iface</w:t>
+      </w:r>
+      <w:proofErr w:type="spellEnd"/>
+      <w:r>
+        <w:t xml:space="preserve"> ens37 </w:t>
+      </w:r>
+      <w:proofErr w:type="spellStart"/>
+      <w:r>
+        <w:t>inet</w:t>
+      </w:r>
+      <w:proofErr w:type="spellEnd"/>
+      <w:r>
+        <w:t xml:space="preserve"> </w:t>
+      </w:r>
+      <w:proofErr w:type="spellStart"/>
+      <w:r>
         <w:t>static</w:t>
       </w:r>
+      <w:proofErr w:type="spellEnd"/>
+      <w:r>
+        <w:t xml:space="preserve"> </w:t>
+      </w:r>
+      <w:r>
+        <w:rPr>
+          <w:i/>
+          <w:iCs/>
+        </w:rPr>
+        <w:t xml:space="preserve">#Permet de configurer l’interfaces ciblé comme </w:t>
+      </w:r>
+      <w:proofErr w:type="spellStart"/>
+      <w:r>
+        <w:rPr>
+          <w:i/>
+          <w:iCs/>
+        </w:rPr>
+        <w:t>static</w:t>
+      </w:r>
+      <w:proofErr w:type="spellEnd"/>
+      <w:r>
+        <w:rPr>
+          <w:i/>
+          <w:iCs/>
+        </w:rPr>
+        <w:t xml:space="preserve"> ou </w:t>
+      </w:r>
+      <w:proofErr w:type="spellStart"/>
+      <w:r>
+        <w:rPr>
+          <w:i/>
+          <w:iCs/>
+        </w:rPr>
+        <w:t>dhcp</w:t>
+      </w:r>
+      <w:proofErr w:type="spellEnd"/>
+      <w:r>
+        <w:rPr>
+          <w:i/>
+          <w:iCs/>
+        </w:rPr>
+        <w:t xml:space="preserve"> (ici </w:t>
+      </w:r>
+      <w:proofErr w:type="spellStart"/>
+      <w:r>
+        <w:rPr>
+          <w:b/>
+          <w:bCs/>
+          <w:i/>
+          <w:iCs/>
+        </w:rPr>
+        <w:t>static</w:t>
+      </w:r>
+      <w:proofErr w:type="spellEnd"/>
       <w:r>
         <w:rPr>
           <w:i/>
@@ -3007,7 +4100,15 @@
       </w:r>
       <w:r>
         <w:br/>
-        <w:t xml:space="preserve">- address 172.20.0.15/24 </w:t>
+        <w:t xml:space="preserve">- </w:t>
+      </w:r>
+      <w:proofErr w:type="spellStart"/>
+      <w:r>
+        <w:t>address</w:t>
+      </w:r>
+      <w:proofErr w:type="spellEnd"/>
+      <w:r>
+        <w:t xml:space="preserve"> 172.20.0.15/24 </w:t>
       </w:r>
       <w:r>
         <w:rPr>
@@ -3077,12 +4178,37 @@
       <w:r>
         <w:t xml:space="preserve">Une fois fait, faite la commande </w:t>
       </w:r>
-      <w:r>
-        <w:rPr>
-          <w:b/>
-          <w:bCs/>
-        </w:rPr>
-        <w:t>sudo systemctl restart networking</w:t>
+      <w:proofErr w:type="spellStart"/>
+      <w:r>
+        <w:rPr>
+          <w:b/>
+          <w:bCs/>
+        </w:rPr>
+        <w:t>sudo</w:t>
+      </w:r>
+      <w:proofErr w:type="spellEnd"/>
+      <w:r>
+        <w:rPr>
+          <w:b/>
+          <w:bCs/>
+        </w:rPr>
+        <w:t xml:space="preserve"> </w:t>
+      </w:r>
+      <w:proofErr w:type="spellStart"/>
+      <w:r>
+        <w:rPr>
+          <w:b/>
+          <w:bCs/>
+        </w:rPr>
+        <w:t>systemctl</w:t>
+      </w:r>
+      <w:proofErr w:type="spellEnd"/>
+      <w:r>
+        <w:rPr>
+          <w:b/>
+          <w:bCs/>
+        </w:rPr>
+        <w:t xml:space="preserve"> restart networking</w:t>
       </w:r>
       <w:r>
         <w:t xml:space="preserve"> pour appliquer </w:t>
@@ -3095,12 +4221,21 @@
       <w:r>
         <w:t xml:space="preserve">Refaite la commande </w:t>
       </w:r>
-      <w:r>
-        <w:rPr>
-          <w:b/>
-          <w:bCs/>
-        </w:rPr>
-        <w:t xml:space="preserve">ip -a </w:t>
+      <w:proofErr w:type="spellStart"/>
+      <w:r>
+        <w:rPr>
+          <w:b/>
+          <w:bCs/>
+        </w:rPr>
+        <w:t>ip</w:t>
+      </w:r>
+      <w:proofErr w:type="spellEnd"/>
+      <w:r>
+        <w:rPr>
+          <w:b/>
+          <w:bCs/>
+        </w:rPr>
+        <w:t xml:space="preserve"> -a </w:t>
       </w:r>
       <w:r>
         <w:t>pou</w:t>
@@ -3410,7 +4545,23 @@
           <w:i/>
           <w:iCs/>
         </w:rPr>
-        <w:t>Indiquer le même segment que la vm linux)</w:t>
+        <w:t xml:space="preserve">Indiquer le même segment que la </w:t>
+      </w:r>
+      <w:proofErr w:type="spellStart"/>
+      <w:r>
+        <w:rPr>
+          <w:i/>
+          <w:iCs/>
+        </w:rPr>
+        <w:t>vm</w:t>
+      </w:r>
+      <w:proofErr w:type="spellEnd"/>
+      <w:r>
+        <w:rPr>
+          <w:i/>
+          <w:iCs/>
+        </w:rPr>
+        <w:t xml:space="preserve"> linux)</w:t>
       </w:r>
       <w:r>
         <w:rPr>
@@ -3576,12 +4727,21 @@
         </w:rPr>
         <w:t xml:space="preserve">Commande : </w:t>
       </w:r>
-      <w:r>
-        <w:rPr>
-          <w:i/>
-          <w:iCs/>
-        </w:rPr>
-        <w:t xml:space="preserve">wget </w:t>
+      <w:proofErr w:type="spellStart"/>
+      <w:r>
+        <w:rPr>
+          <w:i/>
+          <w:iCs/>
+        </w:rPr>
+        <w:t>wget</w:t>
+      </w:r>
+      <w:proofErr w:type="spellEnd"/>
+      <w:r>
+        <w:rPr>
+          <w:i/>
+          <w:iCs/>
+        </w:rPr>
+        <w:t xml:space="preserve"> </w:t>
       </w:r>
       <w:hyperlink r:id="rId42" w:history="1">
         <w:r>
@@ -3622,7 +4782,40 @@
         <w:t>Commande :</w:t>
       </w:r>
       <w:r>
-        <w:t xml:space="preserve"> tar xvzf glpi-10.0.3.tgz</w:t>
+        <w:t xml:space="preserve"> </w:t>
+      </w:r>
+      <w:r>
+        <w:rPr>
+          <w:i/>
+          <w:iCs/>
+        </w:rPr>
+        <w:t xml:space="preserve">tar </w:t>
+      </w:r>
+      <w:proofErr w:type="spellStart"/>
+      <w:r>
+        <w:rPr>
+          <w:i/>
+          <w:iCs/>
+        </w:rPr>
+        <w:t>xvzf</w:t>
+      </w:r>
+      <w:proofErr w:type="spellEnd"/>
+      <w:r>
+        <w:rPr>
+          <w:i/>
+          <w:iCs/>
+        </w:rPr>
+        <w:t xml:space="preserve"> glpi-10.0.3.tgz</w:t>
+      </w:r>
+      <w:r>
+        <w:br/>
+      </w:r>
+      <w:r>
+        <w:rPr>
+          <w:i/>
+          <w:iCs/>
+        </w:rPr>
+        <w:t>décompresser le dossier</w:t>
       </w:r>
     </w:p>
     <w:p>
@@ -3645,7 +4838,911 @@
         <w:t>Commande :</w:t>
       </w:r>
       <w:r>
-        <w:t xml:space="preserve"> chown -R www-data:www-data /var/www/html/glpi</w:t>
+        <w:t xml:space="preserve"> </w:t>
+      </w:r>
+      <w:proofErr w:type="spellStart"/>
+      <w:r>
+        <w:rPr>
+          <w:i/>
+          <w:iCs/>
+        </w:rPr>
+        <w:t>chown</w:t>
+      </w:r>
+      <w:proofErr w:type="spellEnd"/>
+      <w:r>
+        <w:rPr>
+          <w:i/>
+          <w:iCs/>
+        </w:rPr>
+        <w:t xml:space="preserve"> -R </w:t>
+      </w:r>
+      <w:proofErr w:type="spellStart"/>
+      <w:r>
+        <w:rPr>
+          <w:i/>
+          <w:iCs/>
+        </w:rPr>
+        <w:t>www-data:www-data</w:t>
+      </w:r>
+      <w:proofErr w:type="spellEnd"/>
+      <w:r>
+        <w:rPr>
+          <w:i/>
+          <w:iCs/>
+        </w:rPr>
+        <w:t xml:space="preserve"> /var/www/html/</w:t>
+      </w:r>
+      <w:proofErr w:type="spellStart"/>
+      <w:r>
+        <w:rPr>
+          <w:i/>
+          <w:iCs/>
+        </w:rPr>
+        <w:t>glpi</w:t>
+      </w:r>
+      <w:proofErr w:type="spellEnd"/>
+      <w:r>
+        <w:rPr>
+          <w:i/>
+          <w:iCs/>
+        </w:rPr>
+        <w:br/>
+        <w:t>Change les droits : www-data(utilisateur) :www-data(groupe)</w:t>
+      </w:r>
+    </w:p>
+    <w:p>
+      <w:pPr>
+        <w:pStyle w:val="Paragraphedeliste"/>
+        <w:numPr>
+          <w:ilvl w:val="0"/>
+          <w:numId w:val="3"/>
+        </w:numPr>
+        <w:rPr>
+          <w:b/>
+          <w:bCs/>
+        </w:rPr>
+      </w:pPr>
+      <w:r>
+        <w:rPr>
+          <w:b/>
+          <w:bCs/>
+        </w:rPr>
+        <w:t>Commande :</w:t>
+      </w:r>
+      <w:r>
+        <w:rPr>
+          <w:i/>
+          <w:iCs/>
+        </w:rPr>
+        <w:t xml:space="preserve">  ls -l </w:t>
+      </w:r>
+      <w:proofErr w:type="spellStart"/>
+      <w:r>
+        <w:rPr>
+          <w:i/>
+          <w:iCs/>
+        </w:rPr>
+        <w:t>glpi</w:t>
+      </w:r>
+      <w:proofErr w:type="spellEnd"/>
+      <w:r>
+        <w:rPr>
+          <w:i/>
+          <w:iCs/>
+        </w:rPr>
+        <w:t xml:space="preserve"> </w:t>
+      </w:r>
+      <w:r>
+        <w:rPr>
+          <w:i/>
+          <w:iCs/>
+        </w:rPr>
+        <w:br/>
+        <w:t>vérifier si les droits sont bien donne</w:t>
+      </w:r>
+    </w:p>
+    <w:p>
+      <w:pPr>
+        <w:pStyle w:val="Paragraphedeliste"/>
+        <w:numPr>
+          <w:ilvl w:val="0"/>
+          <w:numId w:val="3"/>
+        </w:numPr>
+        <w:rPr>
+          <w:b/>
+          <w:bCs/>
+        </w:rPr>
+      </w:pPr>
+      <w:r>
+        <w:rPr>
+          <w:b/>
+          <w:bCs/>
+        </w:rPr>
+        <w:t>Installe les paquets nécessaires au fonctionnement de GLPI</w:t>
+      </w:r>
+    </w:p>
+    <w:p>
+      <w:pPr>
+        <w:pStyle w:val="Default"/>
+        <w:ind w:left="708"/>
+        <w:rPr>
+          <w:i/>
+          <w:iCs/>
+          <w:sz w:val="23"/>
+          <w:szCs w:val="23"/>
+        </w:rPr>
+      </w:pPr>
+      <w:proofErr w:type="spellStart"/>
+      <w:r>
+        <w:rPr>
+          <w:i/>
+          <w:iCs/>
+          <w:sz w:val="23"/>
+          <w:szCs w:val="23"/>
+        </w:rPr>
+        <w:t>apt</w:t>
+      </w:r>
+      <w:proofErr w:type="spellEnd"/>
+      <w:r>
+        <w:rPr>
+          <w:i/>
+          <w:iCs/>
+          <w:sz w:val="23"/>
+          <w:szCs w:val="23"/>
+        </w:rPr>
+        <w:t xml:space="preserve"> </w:t>
+      </w:r>
+      <w:proofErr w:type="spellStart"/>
+      <w:r>
+        <w:rPr>
+          <w:i/>
+          <w:iCs/>
+          <w:sz w:val="23"/>
+          <w:szCs w:val="23"/>
+        </w:rPr>
+        <w:t>install</w:t>
+      </w:r>
+      <w:proofErr w:type="spellEnd"/>
+      <w:r>
+        <w:rPr>
+          <w:i/>
+          <w:iCs/>
+          <w:sz w:val="23"/>
+          <w:szCs w:val="23"/>
+        </w:rPr>
+        <w:t xml:space="preserve"> </w:t>
+      </w:r>
+      <w:proofErr w:type="spellStart"/>
+      <w:r>
+        <w:rPr>
+          <w:i/>
+          <w:iCs/>
+          <w:sz w:val="23"/>
+          <w:szCs w:val="23"/>
+        </w:rPr>
+        <w:t>php-ldap</w:t>
+      </w:r>
+      <w:proofErr w:type="spellEnd"/>
+      <w:r>
+        <w:rPr>
+          <w:i/>
+          <w:iCs/>
+          <w:sz w:val="23"/>
+          <w:szCs w:val="23"/>
+        </w:rPr>
+        <w:t xml:space="preserve"> </w:t>
+      </w:r>
+    </w:p>
+    <w:p>
+      <w:pPr>
+        <w:pStyle w:val="Default"/>
+        <w:ind w:left="708"/>
+        <w:rPr>
+          <w:i/>
+          <w:iCs/>
+          <w:sz w:val="23"/>
+          <w:szCs w:val="23"/>
+        </w:rPr>
+      </w:pPr>
+      <w:proofErr w:type="spellStart"/>
+      <w:r>
+        <w:rPr>
+          <w:i/>
+          <w:iCs/>
+          <w:sz w:val="23"/>
+          <w:szCs w:val="23"/>
+        </w:rPr>
+        <w:t>apt</w:t>
+      </w:r>
+      <w:proofErr w:type="spellEnd"/>
+      <w:r>
+        <w:rPr>
+          <w:i/>
+          <w:iCs/>
+          <w:sz w:val="23"/>
+          <w:szCs w:val="23"/>
+        </w:rPr>
+        <w:t xml:space="preserve"> </w:t>
+      </w:r>
+      <w:proofErr w:type="spellStart"/>
+      <w:r>
+        <w:rPr>
+          <w:i/>
+          <w:iCs/>
+          <w:sz w:val="23"/>
+          <w:szCs w:val="23"/>
+        </w:rPr>
+        <w:t>install</w:t>
+      </w:r>
+      <w:proofErr w:type="spellEnd"/>
+      <w:r>
+        <w:rPr>
+          <w:i/>
+          <w:iCs/>
+          <w:sz w:val="23"/>
+          <w:szCs w:val="23"/>
+        </w:rPr>
+        <w:t xml:space="preserve"> </w:t>
+      </w:r>
+      <w:proofErr w:type="spellStart"/>
+      <w:r>
+        <w:rPr>
+          <w:i/>
+          <w:iCs/>
+          <w:sz w:val="23"/>
+          <w:szCs w:val="23"/>
+        </w:rPr>
+        <w:t>php-imap</w:t>
+      </w:r>
+      <w:proofErr w:type="spellEnd"/>
+      <w:r>
+        <w:rPr>
+          <w:i/>
+          <w:iCs/>
+          <w:sz w:val="23"/>
+          <w:szCs w:val="23"/>
+        </w:rPr>
+        <w:t xml:space="preserve"> </w:t>
+      </w:r>
+    </w:p>
+    <w:p>
+      <w:pPr>
+        <w:pStyle w:val="Default"/>
+        <w:ind w:left="708"/>
+        <w:rPr>
+          <w:i/>
+          <w:iCs/>
+          <w:sz w:val="23"/>
+          <w:szCs w:val="23"/>
+        </w:rPr>
+      </w:pPr>
+      <w:proofErr w:type="spellStart"/>
+      <w:r>
+        <w:rPr>
+          <w:i/>
+          <w:iCs/>
+          <w:sz w:val="23"/>
+          <w:szCs w:val="23"/>
+        </w:rPr>
+        <w:t>apt</w:t>
+      </w:r>
+      <w:proofErr w:type="spellEnd"/>
+      <w:r>
+        <w:rPr>
+          <w:i/>
+          <w:iCs/>
+          <w:sz w:val="23"/>
+          <w:szCs w:val="23"/>
+        </w:rPr>
+        <w:t xml:space="preserve"> </w:t>
+      </w:r>
+      <w:proofErr w:type="spellStart"/>
+      <w:r>
+        <w:rPr>
+          <w:i/>
+          <w:iCs/>
+          <w:sz w:val="23"/>
+          <w:szCs w:val="23"/>
+        </w:rPr>
+        <w:t>install</w:t>
+      </w:r>
+      <w:proofErr w:type="spellEnd"/>
+      <w:r>
+        <w:rPr>
+          <w:i/>
+          <w:iCs/>
+          <w:sz w:val="23"/>
+          <w:szCs w:val="23"/>
+        </w:rPr>
+        <w:t xml:space="preserve"> </w:t>
+      </w:r>
+      <w:proofErr w:type="spellStart"/>
+      <w:r>
+        <w:rPr>
+          <w:i/>
+          <w:iCs/>
+          <w:sz w:val="23"/>
+          <w:szCs w:val="23"/>
+        </w:rPr>
+        <w:t>php-xmlrpc</w:t>
+      </w:r>
+      <w:proofErr w:type="spellEnd"/>
+      <w:r>
+        <w:rPr>
+          <w:i/>
+          <w:iCs/>
+          <w:sz w:val="23"/>
+          <w:szCs w:val="23"/>
+        </w:rPr>
+        <w:t xml:space="preserve"> </w:t>
+      </w:r>
+    </w:p>
+    <w:p>
+      <w:pPr>
+        <w:pStyle w:val="Default"/>
+        <w:ind w:left="708"/>
+        <w:rPr>
+          <w:i/>
+          <w:iCs/>
+          <w:sz w:val="23"/>
+          <w:szCs w:val="23"/>
+        </w:rPr>
+      </w:pPr>
+      <w:proofErr w:type="spellStart"/>
+      <w:r>
+        <w:rPr>
+          <w:i/>
+          <w:iCs/>
+          <w:sz w:val="23"/>
+          <w:szCs w:val="23"/>
+        </w:rPr>
+        <w:t>apt</w:t>
+      </w:r>
+      <w:proofErr w:type="spellEnd"/>
+      <w:r>
+        <w:rPr>
+          <w:i/>
+          <w:iCs/>
+          <w:sz w:val="23"/>
+          <w:szCs w:val="23"/>
+        </w:rPr>
+        <w:t xml:space="preserve"> </w:t>
+      </w:r>
+      <w:proofErr w:type="spellStart"/>
+      <w:r>
+        <w:rPr>
+          <w:i/>
+          <w:iCs/>
+          <w:sz w:val="23"/>
+          <w:szCs w:val="23"/>
+        </w:rPr>
+        <w:t>install</w:t>
+      </w:r>
+      <w:proofErr w:type="spellEnd"/>
+      <w:r>
+        <w:rPr>
+          <w:i/>
+          <w:iCs/>
+          <w:sz w:val="23"/>
+          <w:szCs w:val="23"/>
+        </w:rPr>
+        <w:t xml:space="preserve"> </w:t>
+      </w:r>
+      <w:proofErr w:type="spellStart"/>
+      <w:r>
+        <w:rPr>
+          <w:i/>
+          <w:iCs/>
+          <w:sz w:val="23"/>
+          <w:szCs w:val="23"/>
+        </w:rPr>
+        <w:t>php-apcu</w:t>
+      </w:r>
+      <w:proofErr w:type="spellEnd"/>
+      <w:r>
+        <w:rPr>
+          <w:i/>
+          <w:iCs/>
+          <w:sz w:val="23"/>
+          <w:szCs w:val="23"/>
+        </w:rPr>
+        <w:t xml:space="preserve"> </w:t>
+      </w:r>
+    </w:p>
+    <w:p>
+      <w:pPr>
+        <w:pStyle w:val="Default"/>
+        <w:ind w:left="708"/>
+        <w:rPr>
+          <w:i/>
+          <w:iCs/>
+          <w:sz w:val="23"/>
+          <w:szCs w:val="23"/>
+        </w:rPr>
+      </w:pPr>
+      <w:proofErr w:type="spellStart"/>
+      <w:r>
+        <w:rPr>
+          <w:i/>
+          <w:iCs/>
+          <w:sz w:val="23"/>
+          <w:szCs w:val="23"/>
+        </w:rPr>
+        <w:t>apt</w:t>
+      </w:r>
+      <w:proofErr w:type="spellEnd"/>
+      <w:r>
+        <w:rPr>
+          <w:i/>
+          <w:iCs/>
+          <w:sz w:val="23"/>
+          <w:szCs w:val="23"/>
+        </w:rPr>
+        <w:t xml:space="preserve"> </w:t>
+      </w:r>
+      <w:proofErr w:type="spellStart"/>
+      <w:r>
+        <w:rPr>
+          <w:i/>
+          <w:iCs/>
+          <w:sz w:val="23"/>
+          <w:szCs w:val="23"/>
+        </w:rPr>
+        <w:t>install</w:t>
+      </w:r>
+      <w:proofErr w:type="spellEnd"/>
+      <w:r>
+        <w:rPr>
+          <w:i/>
+          <w:iCs/>
+          <w:sz w:val="23"/>
+          <w:szCs w:val="23"/>
+        </w:rPr>
+        <w:t xml:space="preserve"> </w:t>
+      </w:r>
+      <w:proofErr w:type="spellStart"/>
+      <w:r>
+        <w:rPr>
+          <w:i/>
+          <w:iCs/>
+          <w:sz w:val="23"/>
+          <w:szCs w:val="23"/>
+        </w:rPr>
+        <w:t>php</w:t>
+      </w:r>
+      <w:proofErr w:type="spellEnd"/>
+      <w:r>
+        <w:rPr>
+          <w:i/>
+          <w:iCs/>
+          <w:sz w:val="23"/>
+          <w:szCs w:val="23"/>
+        </w:rPr>
+        <w:t>-cas</w:t>
+      </w:r>
+    </w:p>
+    <w:p>
+      <w:pPr>
+        <w:pStyle w:val="Default"/>
+        <w:rPr>
+          <w:sz w:val="23"/>
+          <w:szCs w:val="23"/>
+        </w:rPr>
+      </w:pPr>
+    </w:p>
+    <w:p>
+      <w:pPr>
+        <w:pStyle w:val="Paragraphedeliste"/>
+        <w:numPr>
+          <w:ilvl w:val="0"/>
+          <w:numId w:val="3"/>
+        </w:numPr>
+        <w:rPr>
+          <w:b/>
+          <w:bCs/>
+        </w:rPr>
+      </w:pPr>
+      <w:r>
+        <w:rPr>
+          <w:b/>
+          <w:bCs/>
+        </w:rPr>
+        <w:t>Ouvrir GLPI dans le navigateur :</w:t>
+      </w:r>
+    </w:p>
+    <w:p>
+      <w:pPr>
+        <w:pStyle w:val="Paragraphedeliste"/>
+        <w:rPr>
+          <w:i/>
+          <w:iCs/>
+        </w:rPr>
+      </w:pPr>
+      <w:r>
+        <w:rPr>
+          <w:b/>
+          <w:bCs/>
+        </w:rPr>
+        <w:t xml:space="preserve">Indiquer : </w:t>
+      </w:r>
+      <w:r>
+        <w:rPr>
+          <w:i/>
+          <w:iCs/>
+        </w:rPr>
+        <w:t>@IPens37/glpi</w:t>
+      </w:r>
+    </w:p>
+    <w:p>
+      <w:pPr>
+        <w:pStyle w:val="Paragraphedeliste"/>
+        <w:numPr>
+          <w:ilvl w:val="0"/>
+          <w:numId w:val="3"/>
+        </w:numPr>
+        <w:rPr>
+          <w:b/>
+          <w:bCs/>
+        </w:rPr>
+      </w:pPr>
+    </w:p>
+    <w:p>
+      <w:pPr>
+        <w:pStyle w:val="Default"/>
+        <w:ind w:left="708"/>
+        <w:rPr>
+          <w:sz w:val="23"/>
+          <w:szCs w:val="23"/>
+        </w:rPr>
+      </w:pPr>
+      <w:r>
+        <w:rPr>
+          <w:b/>
+          <w:bCs/>
+        </w:rPr>
+        <w:t>Indiquer les paramètres :</w:t>
+      </w:r>
+      <w:r>
+        <w:rPr>
+          <w:b/>
+          <w:bCs/>
+        </w:rPr>
+        <w:br/>
+      </w:r>
+      <w:r>
+        <w:rPr>
+          <w:sz w:val="23"/>
+          <w:szCs w:val="23"/>
+        </w:rPr>
+        <w:t xml:space="preserve">Installer </w:t>
+      </w:r>
+    </w:p>
+    <w:p>
+      <w:pPr>
+        <w:pStyle w:val="Default"/>
+        <w:ind w:left="708"/>
+        <w:rPr>
+          <w:sz w:val="23"/>
+          <w:szCs w:val="23"/>
+        </w:rPr>
+      </w:pPr>
+      <w:r>
+        <w:rPr>
+          <w:sz w:val="23"/>
+          <w:szCs w:val="23"/>
+        </w:rPr>
+        <w:t xml:space="preserve">Continuer (Oui) </w:t>
+      </w:r>
+    </w:p>
+    <w:p>
+      <w:pPr>
+        <w:pStyle w:val="Default"/>
+        <w:ind w:left="708"/>
+        <w:rPr>
+          <w:sz w:val="23"/>
+          <w:szCs w:val="23"/>
+        </w:rPr>
+      </w:pPr>
+      <w:r>
+        <w:rPr>
+          <w:sz w:val="23"/>
+          <w:szCs w:val="23"/>
+        </w:rPr>
+        <w:t xml:space="preserve">Pour la chaîne de connexion : </w:t>
+      </w:r>
+    </w:p>
+    <w:p>
+      <w:pPr>
+        <w:pStyle w:val="Default"/>
+        <w:ind w:left="708"/>
+        <w:rPr>
+          <w:sz w:val="23"/>
+          <w:szCs w:val="23"/>
+        </w:rPr>
+      </w:pPr>
+      <w:r>
+        <w:rPr>
+          <w:sz w:val="23"/>
+          <w:szCs w:val="23"/>
+        </w:rPr>
+        <w:t>Serveur SQL (</w:t>
+      </w:r>
+      <w:proofErr w:type="spellStart"/>
+      <w:r>
+        <w:rPr>
+          <w:sz w:val="23"/>
+          <w:szCs w:val="23"/>
+        </w:rPr>
+        <w:t>MariaDB</w:t>
+      </w:r>
+      <w:proofErr w:type="spellEnd"/>
+      <w:r>
+        <w:rPr>
+          <w:sz w:val="23"/>
+          <w:szCs w:val="23"/>
+        </w:rPr>
+        <w:t xml:space="preserve"> ou MySQL) : localhost </w:t>
+      </w:r>
+    </w:p>
+    <w:p>
+      <w:pPr>
+        <w:pStyle w:val="Default"/>
+        <w:ind w:left="708"/>
+        <w:rPr>
+          <w:sz w:val="23"/>
+          <w:szCs w:val="23"/>
+        </w:rPr>
+      </w:pPr>
+      <w:r>
+        <w:rPr>
+          <w:sz w:val="23"/>
+          <w:szCs w:val="23"/>
+        </w:rPr>
+        <w:t xml:space="preserve">Utilisateur SQL : </w:t>
+      </w:r>
+      <w:proofErr w:type="spellStart"/>
+      <w:r>
+        <w:rPr>
+          <w:sz w:val="23"/>
+          <w:szCs w:val="23"/>
+        </w:rPr>
+        <w:t>glpiuser</w:t>
+      </w:r>
+      <w:proofErr w:type="spellEnd"/>
+      <w:r>
+        <w:rPr>
+          <w:sz w:val="23"/>
+          <w:szCs w:val="23"/>
+        </w:rPr>
+        <w:t xml:space="preserve"> </w:t>
+      </w:r>
+    </w:p>
+    <w:p>
+      <w:pPr>
+        <w:pStyle w:val="Default"/>
+        <w:ind w:left="708"/>
+        <w:rPr>
+          <w:sz w:val="23"/>
+          <w:szCs w:val="23"/>
+        </w:rPr>
+      </w:pPr>
+      <w:r>
+        <w:rPr>
+          <w:sz w:val="23"/>
+          <w:szCs w:val="23"/>
+        </w:rPr>
+        <w:t xml:space="preserve">Mot de passe SQL : </w:t>
+      </w:r>
+      <w:proofErr w:type="spellStart"/>
+      <w:r>
+        <w:rPr>
+          <w:sz w:val="23"/>
+          <w:szCs w:val="23"/>
+        </w:rPr>
+        <w:t>password</w:t>
+      </w:r>
+      <w:proofErr w:type="spellEnd"/>
+      <w:r>
+        <w:rPr>
+          <w:sz w:val="23"/>
+          <w:szCs w:val="23"/>
+        </w:rPr>
+        <w:t xml:space="preserve"> </w:t>
+      </w:r>
+    </w:p>
+    <w:p>
+      <w:pPr>
+        <w:pStyle w:val="Default"/>
+        <w:ind w:left="708"/>
+        <w:rPr>
+          <w:sz w:val="23"/>
+          <w:szCs w:val="23"/>
+        </w:rPr>
+      </w:pPr>
+      <w:r>
+        <w:rPr>
+          <w:sz w:val="23"/>
+          <w:szCs w:val="23"/>
+        </w:rPr>
+        <w:t>Choisir la base de données "</w:t>
+      </w:r>
+      <w:proofErr w:type="spellStart"/>
+      <w:r>
+        <w:rPr>
+          <w:sz w:val="23"/>
+          <w:szCs w:val="23"/>
+        </w:rPr>
+        <w:t>glpidb</w:t>
+      </w:r>
+      <w:proofErr w:type="spellEnd"/>
+      <w:r>
+        <w:rPr>
+          <w:sz w:val="23"/>
+          <w:szCs w:val="23"/>
+        </w:rPr>
+        <w:t xml:space="preserve">" puis suivant </w:t>
+      </w:r>
+    </w:p>
+    <w:p>
+      <w:pPr>
+        <w:pStyle w:val="Default"/>
+        <w:ind w:left="708"/>
+        <w:rPr>
+          <w:sz w:val="23"/>
+          <w:szCs w:val="23"/>
+        </w:rPr>
+      </w:pPr>
+      <w:r>
+        <w:rPr>
+          <w:sz w:val="23"/>
+          <w:szCs w:val="23"/>
+        </w:rPr>
+        <w:t xml:space="preserve">Finalisation de </w:t>
+      </w:r>
+      <w:proofErr w:type="spellStart"/>
+      <w:r>
+        <w:rPr>
+          <w:sz w:val="23"/>
+          <w:szCs w:val="23"/>
+        </w:rPr>
+        <w:t>GlPI</w:t>
+      </w:r>
+      <w:proofErr w:type="spellEnd"/>
+      <w:r>
+        <w:rPr>
+          <w:sz w:val="23"/>
+          <w:szCs w:val="23"/>
+        </w:rPr>
+        <w:t xml:space="preserve">, Continuer </w:t>
+      </w:r>
+    </w:p>
+    <w:p>
+      <w:pPr>
+        <w:pStyle w:val="Default"/>
+        <w:ind w:left="708"/>
+        <w:rPr>
+          <w:sz w:val="23"/>
+          <w:szCs w:val="23"/>
+        </w:rPr>
+      </w:pPr>
+      <w:r>
+        <w:rPr>
+          <w:sz w:val="23"/>
+          <w:szCs w:val="23"/>
+        </w:rPr>
+        <w:t xml:space="preserve">Utiliser GLPI : </w:t>
+      </w:r>
+    </w:p>
+    <w:p>
+      <w:pPr>
+        <w:pStyle w:val="Paragraphedeliste"/>
+        <w:ind w:left="1428"/>
+        <w:rPr>
+          <w:b/>
+          <w:bCs/>
+        </w:rPr>
+      </w:pPr>
+      <w:r>
+        <w:rPr>
+          <w:sz w:val="23"/>
+          <w:szCs w:val="23"/>
+        </w:rPr>
+        <w:t xml:space="preserve">Login : </w:t>
+      </w:r>
+      <w:proofErr w:type="spellStart"/>
+      <w:r>
+        <w:rPr>
+          <w:sz w:val="23"/>
+          <w:szCs w:val="23"/>
+        </w:rPr>
+        <w:t>glpi</w:t>
+      </w:r>
+      <w:proofErr w:type="spellEnd"/>
+      <w:r>
+        <w:rPr>
+          <w:sz w:val="23"/>
+          <w:szCs w:val="23"/>
+        </w:rPr>
+        <w:t>/</w:t>
+      </w:r>
+      <w:proofErr w:type="spellStart"/>
+      <w:r>
+        <w:rPr>
+          <w:sz w:val="23"/>
+          <w:szCs w:val="23"/>
+        </w:rPr>
+        <w:t>glpi</w:t>
+      </w:r>
+      <w:proofErr w:type="spellEnd"/>
+      <w:r>
+        <w:rPr>
+          <w:sz w:val="23"/>
+          <w:szCs w:val="23"/>
+        </w:rPr>
+        <w:tab/>
+      </w:r>
+      <w:r>
+        <w:rPr>
+          <w:b/>
+          <w:bCs/>
+        </w:rPr>
+        <w:br/>
+      </w:r>
+    </w:p>
+    <w:p>
+      <w:pPr>
+        <w:rPr>
+          <w:b/>
+          <w:bCs/>
+        </w:rPr>
+      </w:pPr>
+      <w:r>
+        <w:rPr>
+          <w:b/>
+          <w:bCs/>
+        </w:rPr>
+        <w:tab/>
+      </w:r>
+    </w:p>
+    <w:p>
+      <w:pPr>
+        <w:pStyle w:val="Paragraphedeliste"/>
+        <w:rPr>
+          <w:b/>
+          <w:bCs/>
+        </w:rPr>
+      </w:pPr>
+    </w:p>
+    <w:p>
+      <w:pPr>
+        <w:pStyle w:val="Paragraphedeliste"/>
+        <w:rPr>
+          <w:sz w:val="23"/>
+          <w:szCs w:val="23"/>
+        </w:rPr>
+      </w:pPr>
+    </w:p>
+    <w:p>
+      <w:pPr>
+        <w:pStyle w:val="Paragraphedeliste"/>
+        <w:rPr>
+          <w:b/>
+          <w:bCs/>
+        </w:rPr>
+      </w:pPr>
+      <w:r>
+        <w:rPr>
+          <w:sz w:val="23"/>
+          <w:szCs w:val="23"/>
+        </w:rPr>
+        <w:tab/>
+      </w:r>
+      <w:r>
+        <w:rPr>
+          <w:i/>
+          <w:iCs/>
+        </w:rPr>
+        <w:t xml:space="preserve"> </w:t>
       </w:r>
     </w:p>
     <w:sectPr>
@@ -3800,6 +5897,95 @@
     </w:lvl>
   </w:abstractNum>
   <w:abstractNum w:abstractNumId="1" w15:restartNumberingAfterBreak="0">
+    <w:nsid w:val="26ED0BA5"/>
+    <w:multiLevelType w:val="hybridMultilevel"/>
+    <w:tmpl w:val="4D2A91D4"/>
+    <w:lvl w:ilvl="0" w:tplc="FFFFFFFF">
+      <w:start w:val="1"/>
+      <w:numFmt w:val="decimal"/>
+      <w:lvlText w:val="%1."/>
+      <w:lvlJc w:val="left"/>
+      <w:pPr>
+        <w:ind w:left="720" w:hanging="360"/>
+      </w:pPr>
+      <w:rPr>
+        <w:rFonts w:hint="default"/>
+      </w:rPr>
+    </w:lvl>
+    <w:lvl w:ilvl="1" w:tplc="FFFFFFFF" w:tentative="1">
+      <w:start w:val="1"/>
+      <w:numFmt w:val="lowerLetter"/>
+      <w:lvlText w:val="%2."/>
+      <w:lvlJc w:val="left"/>
+      <w:pPr>
+        <w:ind w:left="1440" w:hanging="360"/>
+      </w:pPr>
+    </w:lvl>
+    <w:lvl w:ilvl="2" w:tplc="FFFFFFFF" w:tentative="1">
+      <w:start w:val="1"/>
+      <w:numFmt w:val="lowerRoman"/>
+      <w:lvlText w:val="%3."/>
+      <w:lvlJc w:val="right"/>
+      <w:pPr>
+        <w:ind w:left="2160" w:hanging="180"/>
+      </w:pPr>
+    </w:lvl>
+    <w:lvl w:ilvl="3" w:tplc="FFFFFFFF" w:tentative="1">
+      <w:start w:val="1"/>
+      <w:numFmt w:val="decimal"/>
+      <w:lvlText w:val="%4."/>
+      <w:lvlJc w:val="left"/>
+      <w:pPr>
+        <w:ind w:left="2880" w:hanging="360"/>
+      </w:pPr>
+    </w:lvl>
+    <w:lvl w:ilvl="4" w:tplc="FFFFFFFF" w:tentative="1">
+      <w:start w:val="1"/>
+      <w:numFmt w:val="lowerLetter"/>
+      <w:lvlText w:val="%5."/>
+      <w:lvlJc w:val="left"/>
+      <w:pPr>
+        <w:ind w:left="3600" w:hanging="360"/>
+      </w:pPr>
+    </w:lvl>
+    <w:lvl w:ilvl="5" w:tplc="FFFFFFFF" w:tentative="1">
+      <w:start w:val="1"/>
+      <w:numFmt w:val="lowerRoman"/>
+      <w:lvlText w:val="%6."/>
+      <w:lvlJc w:val="right"/>
+      <w:pPr>
+        <w:ind w:left="4320" w:hanging="180"/>
+      </w:pPr>
+    </w:lvl>
+    <w:lvl w:ilvl="6" w:tplc="FFFFFFFF" w:tentative="1">
+      <w:start w:val="1"/>
+      <w:numFmt w:val="decimal"/>
+      <w:lvlText w:val="%7."/>
+      <w:lvlJc w:val="left"/>
+      <w:pPr>
+        <w:ind w:left="5040" w:hanging="360"/>
+      </w:pPr>
+    </w:lvl>
+    <w:lvl w:ilvl="7" w:tplc="FFFFFFFF" w:tentative="1">
+      <w:start w:val="1"/>
+      <w:numFmt w:val="lowerLetter"/>
+      <w:lvlText w:val="%8."/>
+      <w:lvlJc w:val="left"/>
+      <w:pPr>
+        <w:ind w:left="5760" w:hanging="360"/>
+      </w:pPr>
+    </w:lvl>
+    <w:lvl w:ilvl="8" w:tplc="FFFFFFFF" w:tentative="1">
+      <w:start w:val="1"/>
+      <w:numFmt w:val="lowerRoman"/>
+      <w:lvlText w:val="%9."/>
+      <w:lvlJc w:val="right"/>
+      <w:pPr>
+        <w:ind w:left="6480" w:hanging="180"/>
+      </w:pPr>
+    </w:lvl>
+  </w:abstractNum>
+  <w:abstractNum w:abstractNumId="2" w15:restartNumberingAfterBreak="0">
     <w:nsid w:val="2D555306"/>
     <w:multiLevelType w:val="hybridMultilevel"/>
     <w:tmpl w:val="63D447E8"/>
@@ -3888,7 +6074,96 @@
       </w:pPr>
     </w:lvl>
   </w:abstractNum>
-  <w:abstractNum w:abstractNumId="2" w15:restartNumberingAfterBreak="0">
+  <w:abstractNum w:abstractNumId="3" w15:restartNumberingAfterBreak="0">
+    <w:nsid w:val="5EE36FC2"/>
+    <w:multiLevelType w:val="hybridMultilevel"/>
+    <w:tmpl w:val="4D2A91D4"/>
+    <w:lvl w:ilvl="0" w:tplc="FFFFFFFF">
+      <w:start w:val="1"/>
+      <w:numFmt w:val="decimal"/>
+      <w:lvlText w:val="%1."/>
+      <w:lvlJc w:val="left"/>
+      <w:pPr>
+        <w:ind w:left="720" w:hanging="360"/>
+      </w:pPr>
+      <w:rPr>
+        <w:rFonts w:hint="default"/>
+      </w:rPr>
+    </w:lvl>
+    <w:lvl w:ilvl="1" w:tplc="FFFFFFFF" w:tentative="1">
+      <w:start w:val="1"/>
+      <w:numFmt w:val="lowerLetter"/>
+      <w:lvlText w:val="%2."/>
+      <w:lvlJc w:val="left"/>
+      <w:pPr>
+        <w:ind w:left="1440" w:hanging="360"/>
+      </w:pPr>
+    </w:lvl>
+    <w:lvl w:ilvl="2" w:tplc="FFFFFFFF" w:tentative="1">
+      <w:start w:val="1"/>
+      <w:numFmt w:val="lowerRoman"/>
+      <w:lvlText w:val="%3."/>
+      <w:lvlJc w:val="right"/>
+      <w:pPr>
+        <w:ind w:left="2160" w:hanging="180"/>
+      </w:pPr>
+    </w:lvl>
+    <w:lvl w:ilvl="3" w:tplc="FFFFFFFF" w:tentative="1">
+      <w:start w:val="1"/>
+      <w:numFmt w:val="decimal"/>
+      <w:lvlText w:val="%4."/>
+      <w:lvlJc w:val="left"/>
+      <w:pPr>
+        <w:ind w:left="2880" w:hanging="360"/>
+      </w:pPr>
+    </w:lvl>
+    <w:lvl w:ilvl="4" w:tplc="FFFFFFFF" w:tentative="1">
+      <w:start w:val="1"/>
+      <w:numFmt w:val="lowerLetter"/>
+      <w:lvlText w:val="%5."/>
+      <w:lvlJc w:val="left"/>
+      <w:pPr>
+        <w:ind w:left="3600" w:hanging="360"/>
+      </w:pPr>
+    </w:lvl>
+    <w:lvl w:ilvl="5" w:tplc="FFFFFFFF" w:tentative="1">
+      <w:start w:val="1"/>
+      <w:numFmt w:val="lowerRoman"/>
+      <w:lvlText w:val="%6."/>
+      <w:lvlJc w:val="right"/>
+      <w:pPr>
+        <w:ind w:left="4320" w:hanging="180"/>
+      </w:pPr>
+    </w:lvl>
+    <w:lvl w:ilvl="6" w:tplc="FFFFFFFF" w:tentative="1">
+      <w:start w:val="1"/>
+      <w:numFmt w:val="decimal"/>
+      <w:lvlText w:val="%7."/>
+      <w:lvlJc w:val="left"/>
+      <w:pPr>
+        <w:ind w:left="5040" w:hanging="360"/>
+      </w:pPr>
+    </w:lvl>
+    <w:lvl w:ilvl="7" w:tplc="FFFFFFFF" w:tentative="1">
+      <w:start w:val="1"/>
+      <w:numFmt w:val="lowerLetter"/>
+      <w:lvlText w:val="%8."/>
+      <w:lvlJc w:val="left"/>
+      <w:pPr>
+        <w:ind w:left="5760" w:hanging="360"/>
+      </w:pPr>
+    </w:lvl>
+    <w:lvl w:ilvl="8" w:tplc="FFFFFFFF" w:tentative="1">
+      <w:start w:val="1"/>
+      <w:numFmt w:val="lowerRoman"/>
+      <w:lvlText w:val="%9."/>
+      <w:lvlJc w:val="right"/>
+      <w:pPr>
+        <w:ind w:left="6480" w:hanging="180"/>
+      </w:pPr>
+    </w:lvl>
+  </w:abstractNum>
+  <w:abstractNum w:abstractNumId="4" w15:restartNumberingAfterBreak="0">
     <w:nsid w:val="63FA3FCA"/>
     <w:multiLevelType w:val="hybridMultilevel"/>
     <w:tmpl w:val="0F5C9340"/>
@@ -4002,13 +6277,19 @@
     </w:lvl>
   </w:abstractNum>
   <w:num w:numId="1" w16cid:durableId="960721960">
-    <w:abstractNumId w:val="1"/>
+    <w:abstractNumId w:val="2"/>
   </w:num>
   <w:num w:numId="2" w16cid:durableId="473095">
-    <w:abstractNumId w:val="2"/>
+    <w:abstractNumId w:val="4"/>
   </w:num>
   <w:num w:numId="3" w16cid:durableId="778305863">
     <w:abstractNumId w:val="0"/>
+  </w:num>
+  <w:num w:numId="4" w16cid:durableId="1710836444">
+    <w:abstractNumId w:val="1"/>
+  </w:num>
+  <w:num w:numId="5" w16cid:durableId="1125461486">
+    <w:abstractNumId w:val="3"/>
   </w:num>
 </w:numbering>
 </file>
@@ -4997,6 +7278,23 @@
       <w:shd w:val="clear" w:color="auto" w:fill="E1DFDD"/>
     </w:rPr>
   </w:style>
+  <w:style w:type="paragraph" w:customStyle="1" w:styleId="Default">
+    <w:name w:val="Default"/>
+    <w:rsid w:val="008643B1"/>
+    <w:pPr>
+      <w:autoSpaceDE w:val="0"/>
+      <w:autoSpaceDN w:val="0"/>
+      <w:adjustRightInd w:val="0"/>
+      <w:spacing w:after="0" w:line="240" w:lineRule="auto"/>
+    </w:pPr>
+    <w:rPr>
+      <w:rFonts w:ascii="Liberation Serif" w:hAnsi="Liberation Serif" w:cs="Liberation Serif"/>
+      <w:color w:val="000000"/>
+      <w:kern w:val="0"/>
+      <w:sz w:val="24"/>
+      <w:szCs w:val="24"/>
+    </w:rPr>
+  </w:style>
 </w:styles>
 </file>
 

</xml_diff>